<commit_message>
Atualiza PRD com fluxo de conexao final
</commit_message>
<xml_diff>
--- a/PRD – Conecta Escola SP.docx
+++ b/PRD – Conecta Escola SP.docx
@@ -33,7 +33,7 @@
     <w:p>
       <w:pPr/>
       <w:r>
-        <w:t xml:space="preserve">O Conecta Escola SP substitui a entrevista e a atribuição em nível de diretoria por uma escolha mútua: o professor monta um perfil e escolhe até 20 escolas de toda a rede, o diretor conecta os professores que quer e, por fim, o professor decide entre as escolas que o conectaram.</w:t>
+        <w:t>O Conecta Escola SP substitui a entrevista e a atribuição em nível de diretoria por uma conexão em duas etapas: o professor monta um perfil e escolhe de 1 a 20 escolas de toda a rede; cada diretor pode conectar os professores que escolheram sua escola; por fim, o professor usa Conectar para finalizar com uma única escola entre as que o conectaram.</w:t>
       </w:r>
     </w:p>
     <w:p>
@@ -164,7 +164,7 @@
     <w:p>
       <w:pPr/>
       <w:r>
-        <w:t xml:space="preserve">O professor completa o perfil em 5 passos, escolhe até 20 escolas em ordem de prioridade e acompanha o resultado.</w:t>
+        <w:t>O professor completa o perfil, escolhe de 1 a 20 escolas e acompanha as conexões recebidas. Depois do envio, voltar à visão do professor abre o acompanhamento, sem reiniciar o cadastro.</w:t>
       </w:r>
     </w:p>
     <w:p>
@@ -242,10 +242,10 @@
         <w:rPr>
           <w:b/>
         </w:rPr>
-        <w:t xml:space="preserve">Fit cultural:</w:t>
-      </w:r>
-      <w:r>
-        <w:t xml:space="preserve"> responde 10 perguntas, uma única vez, sem poder editar depois.</w:t>
+        <w:t xml:space="preserve">Fit cultural: </w:t>
+      </w:r>
+      <w:r>
+        <w:t>responde 10 perguntas. O rascunho é salvo durante o preenchimento; as respostas completas são registradas ao clicar em Registrar respostas ou ao avançar. Depois do registro, não podem ser editadas.</w:t>
       </w:r>
     </w:p>
     <w:p>
@@ -296,10 +296,10 @@
         <w:rPr>
           <w:b/>
         </w:rPr>
-        <w:t xml:space="preserve">Escolha de escolas:</w:t>
-      </w:r>
-      <w:r>
-        <w:t xml:space="preserve"> seleciona até 20 escolas de qualquer diretoria.</w:t>
+        <w:t xml:space="preserve">Escolha de escolas: </w:t>
+      </w:r>
+      <w:r>
+        <w:t>seleciona de 1 a 20 escolas de qualquer diretoria.</w:t>
       </w:r>
     </w:p>
     <w:p>
@@ -314,10 +314,10 @@
         <w:rPr>
           <w:b/>
         </w:rPr>
-        <w:t xml:space="preserve">Revisão e envio:</w:t>
-      </w:r>
-      <w:r>
-        <w:t xml:space="preserve"> vê a prévia do mini currículo como o diretor verá e confirma.</w:t>
+        <w:t xml:space="preserve">Revisão e envio: </w:t>
+      </w:r>
+      <w:r>
+        <w:t>vê a prévia do mini currículo, o total de respostas de fit preenchidas e confirma o envio. Se as 10 respostas estiverem completas no rascunho, o envio as registra. Se faltar alguma, o usuário pode voltar por Editar fit cultural.</w:t>
       </w:r>
     </w:p>
     <w:p>
@@ -332,10 +332,10 @@
         <w:rPr>
           <w:b/>
         </w:rPr>
-        <w:t xml:space="preserve">Acompanhamento:</w:t>
-      </w:r>
-      <w:r>
-        <w:t xml:space="preserve"> vê o status do processo. Encerrado o prazo dos diretores, vê as escolas que o conectaram e confirma uma delas.</w:t>
+        <w:t xml:space="preserve">Acompanhamento: </w:t>
+      </w:r>
+      <w:r>
+        <w:t>após o envio, vê o status e as escolas que o conectaram. No protótipo, as conexões aparecem assim que o diretor decide. O professor clica em Conectar em uma única escola para finalizar.</w:t>
       </w:r>
     </w:p>
     <w:p>
@@ -485,33 +485,8 @@
             <w:tcW w:w="4680" w:type="dxa"/>
           </w:tcPr>
           <w:p>
-            <w:pPr/>
-            <w:r>
-              <w:t xml:space="preserve">Faltam foto, perguntas, vídeo ou escolas</w:t>
-            </w:r>
-          </w:p>
-        </w:tc>
-      </w:tr>
-      <w:tr>
-        <w:tc>
-          <w:tcPr>
-            <w:tcW w:w="4680" w:type="dxa"/>
-          </w:tcPr>
-          <w:p>
-            <w:pPr/>
-            <w:r>
-              <w:t xml:space="preserve">Perfil enviado</w:t>
-            </w:r>
-          </w:p>
-        </w:tc>
-        <w:tc>
-          <w:tcPr>
-            <w:tcW w:w="4680" w:type="dxa"/>
-          </w:tcPr>
-          <w:p>
-            <w:pPr/>
-            <w:r>
-              <w:t xml:space="preserve">Perfil completo, aguardando os diretores</w:t>
+            <w:r>
+              <w:t>Faltam foto, 10 respostas de fit registradas, vídeo ou ao menos uma escola</w:t>
             </w:r>
           </w:p>
         </w:tc>
@@ -557,33 +532,30 @@
             <w:tcW w:w="4680" w:type="dxa"/>
           </w:tcPr>
           <w:p>
-            <w:pPr/>
-            <w:r>
-              <w:t xml:space="preserve">Uma ou mais escolas conectaram; o professor precisa confirmar uma</w:t>
-            </w:r>
-          </w:p>
-        </w:tc>
-      </w:tr>
-      <w:tr>
-        <w:tc>
-          <w:tcPr>
-            <w:tcW w:w="4680" w:type="dxa"/>
-          </w:tcPr>
-          <w:p>
-            <w:pPr/>
-            <w:r>
-              <w:t xml:space="preserve">Confirmado</w:t>
-            </w:r>
-          </w:p>
-        </w:tc>
-        <w:tc>
-          <w:tcPr>
-            <w:tcW w:w="4680" w:type="dxa"/>
-          </w:tcPr>
-          <w:p>
-            <w:pPr/>
-            <w:r>
-              <w:t xml:space="preserve">Professor confirmou a escola escolhida</w:t>
+            <w:r>
+              <w:t>Uma ou mais escolas conectaram; o professor precisa finalizar com uma</w:t>
+            </w:r>
+          </w:p>
+        </w:tc>
+      </w:tr>
+      <w:tr>
+        <w:tc>
+          <w:tcPr>
+            <w:tcW w:w="4680" w:type="dxa"/>
+          </w:tcPr>
+          <w:p>
+            <w:r>
+              <w:t>Conexão finalizada</w:t>
+            </w:r>
+          </w:p>
+        </w:tc>
+        <w:tc>
+          <w:tcPr>
+            <w:tcW w:w="4680" w:type="dxa"/>
+          </w:tcPr>
+          <w:p>
+            <w:r>
+              <w:t>Professor conectou com uma escola</w:t>
             </w:r>
           </w:p>
         </w:tc>
@@ -643,7 +615,7 @@
         </w:numPr>
       </w:pPr>
       <w:r>
-        <w:t xml:space="preserve">Durante o prazo, pode editar foto, comentário, vídeo e escolas; as perguntas de fit não podem ser editadas</w:t>
+        <w:t>Durante o prazo, pode editar foto, comentário, vídeo e escolas; as respostas de fit ficam bloqueadas após o registro das 10 perguntas</w:t>
       </w:r>
     </w:p>
     <w:p>
@@ -667,7 +639,7 @@
         </w:numPr>
       </w:pPr>
       <w:r>
-        <w:t xml:space="preserve">Na etapa de escolha, vê somente as escolas que o conectaram e confirma apenas uma</w:t>
+        <w:t>Após enviar o perfil, Continuar e a troca para a visão do professor levam ao acompanhamento, sem reabrir o cadastro</w:t>
       </w:r>
     </w:p>
     <w:p>
@@ -679,7 +651,19 @@
         </w:numPr>
       </w:pPr>
       <w:r>
-        <w:t xml:space="preserve">A confirmação é definitiva</w:t>
+        <w:t>No acompanhamento, vê somente as escolas que o conectaram e pode usar Conectar em apenas uma; a conexão é definitiva</w:t>
+      </w:r>
+    </w:p>
+    <w:p>
+      <w:pPr>
+        <w:pStyle w:val="ListParagraph"/>
+        <w:numPr>
+          <w:ilvl w:val="0"/>
+          <w:numId w:val="5"/>
+        </w:numPr>
+      </w:pPr>
+      <w:r>
+        <w:t>Depois da conexão final, as demais escolas ficam indisponíveis e as decisões dos diretores são bloqueadas no protótipo</w:t>
       </w:r>
     </w:p>
     <w:p>
@@ -717,10 +701,10 @@
         <w:rPr>
           <w:b/>
         </w:rPr>
-        <w:t xml:space="preserve">Acesso:</w:t>
-      </w:r>
-      <w:r>
-        <w:t xml:space="preserve"> entra pela SED e vê um painel com o total de candidatos, quantos já foram conectados ou passados e quantos estão pendentes.</w:t>
+        <w:t xml:space="preserve">Acesso: </w:t>
+      </w:r>
+      <w:r>
+        <w:t>entra pela SED e vê um painel da sua escola com o total de candidatos, quantos já foram conectados ou passados e quantos estão pendentes. No protótipo, seleciona a escola do diretor para simular mais de uma escola.</w:t>
       </w:r>
     </w:p>
     <w:p>
@@ -789,10 +773,10 @@
         <w:rPr>
           <w:b/>
         </w:rPr>
-        <w:t xml:space="preserve">Acompanhamento:</w:t>
-      </w:r>
-      <w:r>
-        <w:t xml:space="preserve"> vê o resultado final da sua escola após o encerramento.</w:t>
+        <w:t xml:space="preserve">Acompanhamento: </w:t>
+      </w:r>
+      <w:r>
+        <w:t>vê se o professor finalizou a conexão com sua escola, escolheu outra ou ainda não concluiu.</w:t>
       </w:r>
     </w:p>
     <w:p>
@@ -1145,7 +1129,37 @@
         </w:numPr>
       </w:pPr>
       <w:r>
-        <w:t xml:space="preserve">A decisão final é do professor: após a escolha dele, o diretor vê "Confirmado na sua escola" ou "Escolheu outra escola"</w:t>
+        <w:rPr>
+          <w:b/>
+        </w:rPr>
+        <w:t xml:space="preserve">A decisão final é do professor: </w:t>
+      </w:r>
+      <w:r>
+        <w:t>após a conexão dele, o diretor vê Conexão finalizada com sua escola ou Escolheu outra escola</w:t>
+      </w:r>
+    </w:p>
+    <w:p>
+      <w:pPr>
+        <w:pStyle w:val="ListParagraph"/>
+        <w:numPr>
+          <w:ilvl w:val="0"/>
+          <w:numId w:val="8"/>
+        </w:numPr>
+      </w:pPr>
+      <w:r>
+        <w:t>O professor só aparece como candidato da escola que selecionou depois de enviar o perfil</w:t>
+      </w:r>
+    </w:p>
+    <w:p>
+      <w:pPr>
+        <w:pStyle w:val="ListParagraph"/>
+        <w:numPr>
+          <w:ilvl w:val="0"/>
+          <w:numId w:val="8"/>
+        </w:numPr>
+      </w:pPr>
+      <w:r>
+        <w:t>A decisão do diretor é registrada por escola; mais de uma escola pode conectar o mesmo professor</w:t>
       </w:r>
     </w:p>
     <w:p>
@@ -1440,7 +1454,7 @@
     <w:p>
       <w:pPr/>
       <w:r>
-        <w:t xml:space="preserve">O diretor escolhe primeiro; depois o professor decide entre as escolas que o conectaram.</w:t>
+        <w:t>O diretor conecta primeiro; depois o professor finaliza a conexão com uma das escolas que o conectaram. No protótipo, essa lista aparece imediatamente após a decisão do diretor; o calendário oficial de liberação continua em aberto.</w:t>
       </w:r>
     </w:p>
     <w:tbl>
@@ -1572,9 +1586,8 @@
             <w:tcW w:w="4680" w:type="dxa"/>
           </w:tcPr>
           <w:p>
-            <w:pPr/>
-            <w:r>
-              <w:t xml:space="preserve">As 10 perguntas de fit cultural são respondidas uma única vez</w:t>
+            <w:r>
+              <w:t>As 10 perguntas de fit cultural têm rascunho persistente; depois de registradas, as respostas não podem ser editadas</w:t>
             </w:r>
           </w:p>
         </w:tc>
@@ -1644,9 +1657,8 @@
             <w:tcW w:w="4680" w:type="dxa"/>
           </w:tcPr>
           <w:p>
-            <w:pPr/>
-            <w:r>
-              <w:t xml:space="preserve">Encerrado o prazo dos diretores, o professor vê as escolas que o conectaram e confirma uma</w:t>
+            <w:r>
+              <w:t>No protótipo, o professor vê no acompanhamento as escolas que o conectaram assim que há decisão do diretor, sem reiniciar o cadastro</w:t>
             </w:r>
           </w:p>
         </w:tc>
@@ -1668,9 +1680,8 @@
             <w:tcW w:w="4680" w:type="dxa"/>
           </w:tcPr>
           <w:p>
-            <w:pPr/>
-            <w:r>
-              <w:t xml:space="preserve">A confirmação do professor é definitiva e libera as demais escolas</w:t>
+            <w:r>
+              <w:t>O professor usa Conectar para finalizar com uma única escola; a conexão é definitiva e libera as demais escolas</w:t>
             </w:r>
           </w:p>
         </w:tc>
@@ -1723,6 +1734,50 @@
           </w:p>
         </w:tc>
       </w:tr>
+      <w:tr>
+        <w:tc>
+          <w:tcPr>
+            <w:tcW w:type="dxa" w:w="4680"/>
+          </w:tcPr>
+          <w:p>
+            <w:r>
+              <w:t>RN11</w:t>
+            </w:r>
+          </w:p>
+        </w:tc>
+        <w:tc>
+          <w:tcPr>
+            <w:tcW w:type="dxa" w:w="4680"/>
+          </w:tcPr>
+          <w:p>
+            <w:r>
+              <w:t>O envio exige foto, 10 respostas completas de fit cultural, vídeo válido e ao menos uma escola; respostas completas no rascunho são registradas no envio</w:t>
+            </w:r>
+          </w:p>
+        </w:tc>
+      </w:tr>
+      <w:tr>
+        <w:tc>
+          <w:tcPr>
+            <w:tcW w:type="dxa" w:w="4680"/>
+          </w:tcPr>
+          <w:p>
+            <w:r>
+              <w:t>RN12</w:t>
+            </w:r>
+          </w:p>
+        </w:tc>
+        <w:tc>
+          <w:tcPr>
+            <w:tcW w:type="dxa" w:w="4680"/>
+          </w:tcPr>
+          <w:p>
+            <w:r>
+              <w:t>Cada decisão do diretor pertence à escola correspondente; a conexão final do professor bloqueia novas decisões no protótipo</w:t>
+            </w:r>
+          </w:p>
+        </w:tc>
+      </w:tr>
     </w:tbl>
     <w:p>
       <w:pPr/>
@@ -1754,7 +1809,7 @@
         </w:numPr>
       </w:pPr>
       <w:r>
-        <w:t xml:space="preserve">☐ Prazo do professor para confirmar e regra se ele não confirmar</w:t>
+        <w:t>☐ Prazo do professor para conectar e regra se ele não conectar</w:t>
       </w:r>
     </w:p>
     <w:p>
@@ -1778,7 +1833,7 @@
         </w:numPr>
       </w:pPr>
       <w:r>
-        <w:t xml:space="preserve">☐ Rodadas: haverá segunda rodada para vagas que sobrarem após as confirmações?</w:t>
+        <w:t>☐ Rodadas: haverá segunda rodada para vagas que sobrarem após as conexões finais?</w:t>
       </w:r>
     </w:p>
     <w:p>
@@ -1838,7 +1893,7 @@
         </w:numPr>
       </w:pPr>
       <w:r>
-        <w:t xml:space="preserve">☐ Calendário: prazo do professor, prazo do diretor, prazo de confirmação e divulgação do resultado</w:t>
+        <w:t>☐ Calendário: prazo do professor, prazo do diretor, liberação das conexões recebidas, prazo da conexão final e divulgação do resultado</w:t>
       </w:r>
     </w:p>
     <w:sectPr>

</xml_diff>